<commit_message>
Stop respondents being blocked by organisation-only sign-in
Independent review of the form builder script found that a school or
Workspace account can default new forms to "restrict to organisation",
which would block friends and family with no warning.

- create_form.gs: setRequireLogin(false) (guarded), a self-check that logs
  a warning if sign-in is still required, and a signed-out test step
- plan document and README: signed-out incognito test of the share link,
  and a note on which sheet tab to export

Co-Authored-By: Claude Sonnet 5.5 <noreply@anthropic.com>
Claude-Session: https://claude.ai/code/session_01QdXwDCRMoij6KDHZqvaqMv
</commit_message>
<xml_diff>
--- a/MGMT 6124/Module 5 Questionnaire/1_Questionnaire_Design_and_Fieldwork_Plan.docx
+++ b/MGMT 6124/Module 5 Questionnaire/1_Questionnaire_Design_and_Fieldwork_Plan.docx
@@ -4585,7 +4585,27 @@
         <w:spacing w:after="60" w:line="264"/>
       </w:pPr>
       <w:r>
-        <w:t xml:space="preserve">Make sure 'Collect email addresses' is off and 'Accepting responses' is on.</w:t>
+        <w:rPr>
+          <w:b/>
+          <w:bCs/>
+        </w:rPr>
+        <w:t xml:space="preserve">Open the share link in a private/incognito window while signed out of Google.</w:t>
+      </w:r>
+      <w:r>
+        <w:t xml:space="preserve"> If it asks you to sign in, open the form's Settings and set responders to Anyone with the link (turn off 'Restrict to users in your organisation'), then test again. A personal Gmail account avoids school-account restrictions.</w:t>
+      </w:r>
+    </w:p>
+    <w:p>
+      <w:pPr>
+        <w:pStyle w:val="ListParagraph"/>
+        <w:numPr>
+          <w:ilvl w:val="0"/>
+          <w:numId w:val="2"/>
+        </w:numPr>
+        <w:spacing w:after="60" w:line="264"/>
+      </w:pPr>
+      <w:r>
+        <w:t xml:space="preserve">Make sure 'Collect email addresses' is off and 'Accepting responses' is on (click Publish if the form says it is not published).</w:t>
       </w:r>
     </w:p>
     <w:p>

</xml_diff>

<commit_message>
Add live SurveyMonkey survey link and team names to the kit
- Survey built in SurveyMonkey (14 questions, 3 pages) with a shareable weblink;
  option wording read back and matched to the question spec
- Names Adekunle Adeniji and Alain Rivera Sanchez on the plan, report cover,
  workbook, form intro and invitation message; role split marked as a suggestion
- Document the SurveyMonkey adaptations (no skip logic, Q10 not capped), plan
  limit risks, and the Google Forms backup route

Co-Authored-By: Claude Sonnet 5.5 <noreply@anthropic.com>
Claude-Session: https://claude.ai/code/session_01QdXwDCRMoij6KDHZqvaqMv
</commit_message>
<xml_diff>
--- a/MGMT 6124/Module 5 Questionnaire/1_Questionnaire_Design_and_Fieldwork_Plan.docx
+++ b/MGMT 6124/Module 5 Questionnaire/1_Questionnaire_Design_and_Fieldwork_Plan.docx
@@ -55,18 +55,20 @@
       </w:r>
       <w:r>
         <w:rPr>
-          <w:shd w:fill="FFFF00" w:color="auto" w:val="clear"/>
+          <w:b/>
+          <w:bCs/>
         </w:rPr>
-        <w:t xml:space="preserve">[your name]</w:t>
+        <w:t xml:space="preserve">Adekunle Adeniji</w:t>
       </w:r>
       <w:r>
         <w:t xml:space="preserve"> and </w:t>
       </w:r>
       <w:r>
         <w:rPr>
-          <w:shd w:fill="FFFF00" w:color="auto" w:val="clear"/>
+          <w:b/>
+          <w:bCs/>
         </w:rPr>
-        <w:t xml:space="preserve">[partner's name]</w:t>
+        <w:t xml:space="preserve">Alain Rivera Sanchez</w:t>
       </w:r>
       <w:r>
         <w:t xml:space="preserve">. Working document: use it to build the form, collect responses and brief your partner. The graded report is a separate file (Report Template).</w:t>
@@ -301,7 +303,7 @@
                 <w:sz w:val="19"/>
                 <w:szCs w:val="19"/>
               </w:rPr>
-              <w:t xml:space="preserve">14 questions in Google Forms, 5 question types, one branching rule, about 4 minutes to finish. Anonymous.</w:t>
+              <w:t xml:space="preserve">14 questions in SurveyMonkey (Google Forms backup included), 5 question types, one skippable page for non-users, about 4 minutes to finish. No names or emails asked.</w:t>
             </w:r>
           </w:p>
         </w:tc>
@@ -1052,7 +1054,7 @@
                 <w:sz w:val="19"/>
                 <w:szCs w:val="19"/>
               </w:rPr>
-              <w:t xml:space="preserve">Built in Google Forms / MS Forms</w:t>
+              <w:t xml:space="preserve">Built in a free survey tool</w:t>
             </w:r>
           </w:p>
         </w:tc>
@@ -1082,7 +1084,7 @@
                 <w:sz w:val="19"/>
                 <w:szCs w:val="19"/>
               </w:rPr>
-              <w:t xml:space="preserve">Met: create_form.gs builds it</w:t>
+              <w:t xml:space="preserve">Met: SurveyMonkey link live (Google Forms backup)</w:t>
             </w:r>
           </w:p>
         </w:tc>
@@ -1112,7 +1114,7 @@
                 <w:sz w:val="19"/>
                 <w:szCs w:val="19"/>
               </w:rPr>
-              <w:t xml:space="preserve">Section 5, step 2</w:t>
+              <w:t xml:space="preserve">Section 5</w:t>
             </w:r>
           </w:p>
         </w:tc>
@@ -2274,7 +2276,7 @@
         <w:t xml:space="preserve">Branching.</w:t>
       </w:r>
       <w:r>
-        <w:t xml:space="preserve"> Anyone who answers 'Never' on Q3 skips Q4 to Q7, which would make no sense for them. Their blanks are not missing data; the workbook uses 'AI users' as the base for those questions.</w:t>
+        <w:t xml:space="preserve"> Anyone who answers 'Never' on Q3 is told to skip Q4 to Q7, which would make no sense for them (SurveyMonkey: a skippable, optional page; Google Forms backup: true skip logic). Their blanks are not missing data; the workbook uses 'AI users' as the base for those questions.</w:t>
       </w:r>
     </w:p>
     <w:p>
@@ -2360,7 +2362,7 @@
         <w:spacing w:after="120" w:line="276"/>
       </w:pPr>
       <w:r>
-        <w:t xml:space="preserve">Exact wording and options. This is also what the Google Forms script builds. Appendix B of the report repeats it.</w:t>
+        <w:t xml:space="preserve">Exact wording and options. This is the wording live in SurveyMonkey and in the Google Forms script. Appendix B of the report repeats it.</w:t>
       </w:r>
     </w:p>
     <w:tbl>
@@ -4488,7 +4490,7 @@
         <w:pStyle w:val="Heading1"/>
       </w:pPr>
       <w:r>
-        <w:t xml:space="preserve">5. Build it and launch</w:t>
+        <w:t xml:space="preserve">5. Where the survey lives and how to launch</w:t>
       </w:r>
     </w:p>
     <w:p>
@@ -4500,40 +4502,18 @@
           <w:b/>
           <w:bCs/>
         </w:rPr>
-        <w:t xml:space="preserve">Step 1. Pick the survey tool.</w:t>
-      </w:r>
-      <w:r>
-        <w:t xml:space="preserve"> Google Forms (free; exports straight to Excel).</w:t>
-      </w:r>
-    </w:p>
-    <w:p>
-      <w:pPr>
-        <w:spacing w:after="120" w:line="276"/>
-      </w:pPr>
-      <w:r>
-        <w:rPr>
-          <w:b/>
-          <w:bCs/>
-        </w:rPr>
-        <w:t xml:space="preserve">Step 2. Create the form.</w:t>
-      </w:r>
-      <w:r>
-        <w:t xml:space="preserve"> Fastest route: open script.google.com, create a new project, paste the contents of create_form.gs, press Run and approve the permissions. The execution log prints the edit link, the share link and the response sheet link. If you prefer to build by hand, use the table in Section 4: it has the exact wording, types and options.</w:t>
-      </w:r>
-    </w:p>
-    <w:p>
-      <w:pPr>
-        <w:spacing w:after="120" w:line="276"/>
-      </w:pPr>
-      <w:r>
-        <w:rPr>
-          <w:b/>
-          <w:bCs/>
-        </w:rPr>
-        <w:t xml:space="preserve">Step 3. Check the form before anyone else sees it.</w:t>
-      </w:r>
-      <w:r>
-        <w:t xml:space="preserve"> Open the share link in a private window and test it twice:</w:t>
+        <w:t xml:space="preserve">The survey is built in SurveyMonkey and the link is live: https://www.surveymonkey.com/r/PL9R5WL</w:t>
+      </w:r>
+      <w:r>
+        <w:t xml:space="preserve"> (survey ID 423822152, collector "Main survey link (Adekunle and Alain)"). It has 3 pages: About you (Q1 to Q3), AI users only (Q4 to Q7) and Everyone (Q8 to Q14). A Google Forms version is also provided (create_form.gs) as a backup.</w:t>
+      </w:r>
+    </w:p>
+    <w:p>
+      <w:pPr>
+        <w:pStyle w:val="Heading2"/>
+      </w:pPr>
+      <w:r>
+        <w:t xml:space="preserve">Differences from the Google Forms version</w:t>
       </w:r>
     </w:p>
     <w:p>
@@ -4546,7 +4526,14 @@
         <w:spacing w:after="60" w:line="264"/>
       </w:pPr>
       <w:r>
-        <w:t xml:space="preserve">Answer 'Never' on Q3 and confirm you jump straight to the last page.</w:t>
+        <w:rPr>
+          <w:b/>
+          <w:bCs/>
+        </w:rPr>
+        <w:t xml:space="preserve">No skip logic.</w:t>
+      </w:r>
+      <w:r>
+        <w:t xml:space="preserve"> The tool that built the survey cannot set skip logic, so Q4 to Q7 sit on their own page marked 'If you answered Never to Q3, skip this page', and those questions are optional. Non-users leave them blank and click Next, which gives the same blanks the workbook expects. Add real skip logic in SurveyMonkey if your plan allows it.</w:t>
       </w:r>
     </w:p>
     <w:p>
@@ -4559,7 +4546,14 @@
         <w:spacing w:after="60" w:line="264"/>
       </w:pPr>
       <w:r>
-        <w:t xml:space="preserve">Answer 'Daily' on Q3 and confirm you see Q4 to Q7.</w:t>
+        <w:rPr>
+          <w:b/>
+          <w:bCs/>
+        </w:rPr>
+        <w:t xml:space="preserve">Q10 is not capped at 3.</w:t>
+      </w:r>
+      <w:r>
+        <w:t xml:space="preserve"> The wording says 'Select up to 3', but SurveyMonkey would not accept a limit through the tool. Set it in the SurveyMonkey editor if your plan allows. The workbook copes with extra ticks either way.</w:t>
       </w:r>
     </w:p>
     <w:p>
@@ -4572,7 +4566,22 @@
         <w:spacing w:after="60" w:line="264"/>
       </w:pPr>
       <w:r>
-        <w:t xml:space="preserve">Try to tick 4 boxes on Q10 and confirm it stops you at 3.</w:t>
+        <w:rPr>
+          <w:b/>
+          <w:bCs/>
+        </w:rPr>
+        <w:t xml:space="preserve">Scale questions (Q7, Q11)</w:t>
+      </w:r>
+      <w:r>
+        <w:t xml:space="preserve"> are single-choice rows labelled '1 - Not at all confident' to '5 - Very confident'. They are converted to numbers 1 to 5 when the data is loaded into the workbook.</w:t>
+      </w:r>
+    </w:p>
+    <w:p>
+      <w:pPr>
+        <w:pStyle w:val="Heading2"/>
+      </w:pPr>
+      <w:r>
+        <w:t xml:space="preserve">Check before you share widely</w:t>
       </w:r>
     </w:p>
     <w:p>
@@ -4589,10 +4598,10 @@
           <w:b/>
           <w:bCs/>
         </w:rPr>
-        <w:t xml:space="preserve">Open the share link in a private/incognito window while signed out of Google.</w:t>
-      </w:r>
-      <w:r>
-        <w:t xml:space="preserve"> If it asks you to sign in, open the form's Settings and set responders to Anyone with the link (turn off 'Restrict to users in your organisation'), then test again. A personal Gmail account avoids school-account restrictions.</w:t>
+        <w:t xml:space="preserve">Check your SurveyMonkey plan.</w:t>
+      </w:r>
+      <w:r>
+        <w:t xml:space="preserve"> Free (Basic) plans have historically limited the questions per survey and how many responses you can view or export, and the connector used to build this survey can only read the first 25 responses on a Basic plan. This survey has 14 questions plus an intro block, and you need 30 or more responses. Open the survey in SurveyMonkey and look for any upgrade or limited-view message. If your plan will not show you 30 or more responses, use the Google Forms version instead (free and unlimited).</w:t>
       </w:r>
     </w:p>
     <w:p>
@@ -4605,47 +4614,100 @@
         <w:spacing w:after="60" w:line="264"/>
       </w:pPr>
       <w:r>
-        <w:t xml:space="preserve">Make sure 'Collect email addresses' is off and 'Accepting responses' is on (click Publish if the form says it is not published).</w:t>
-      </w:r>
-    </w:p>
-    <w:p>
-      <w:pPr>
-        <w:spacing w:after="120" w:line="276"/>
-      </w:pPr>
-      <w:r>
         <w:rPr>
           <w:b/>
           <w:bCs/>
         </w:rPr>
-        <w:t xml:space="preserve">Step 4. Pilot with 2 or 3 people.</w:t>
-      </w:r>
-      <w:r>
-        <w:t xml:space="preserve"> Ask them to time it and tell you any question that confused them. Fix wording </w:t>
-      </w:r>
+        <w:t xml:space="preserve">Test with Preview, not the live link.</w:t>
+      </w:r>
+      <w:r>
+        <w:t xml:space="preserve"> Every submitted response, tests included, counts toward plan limits and must be deleted before analysis.</w:t>
+      </w:r>
+    </w:p>
+    <w:p>
+      <w:pPr>
+        <w:pStyle w:val="ListParagraph"/>
+        <w:numPr>
+          <w:ilvl w:val="0"/>
+          <w:numId w:val="2"/>
+        </w:numPr>
+        <w:spacing w:after="60" w:line="264"/>
+      </w:pPr>
       <w:r>
         <w:rPr>
           <w:b/>
           <w:bCs/>
         </w:rPr>
-        <w:t xml:space="preserve">before</w:t>
-      </w:r>
-      <w:r>
-        <w:t xml:space="preserve"> launch: changing option wording later breaks the match with the workbook (the 'Unmatched answers' check will flag it). Delete the pilot responses from the sheet before analysis.</w:t>
-      </w:r>
-    </w:p>
-    <w:p>
-      <w:pPr>
-        <w:spacing w:after="120" w:line="276"/>
+        <w:t xml:space="preserve">Anonymity.</w:t>
+      </w:r>
+      <w:r>
+        <w:t xml:space="preserve"> The questions do not ask for names or emails, but SurveyMonkey weblinks record IP addresses unless 'Anonymous Responses' is switched on in the collector settings. Turn it on if you want to tell respondents nothing identifying is stored.</w:t>
+      </w:r>
+    </w:p>
+    <w:p>
+      <w:pPr>
+        <w:pStyle w:val="ListParagraph"/>
+        <w:numPr>
+          <w:ilvl w:val="0"/>
+          <w:numId w:val="2"/>
+        </w:numPr>
+        <w:spacing w:after="60" w:line="264"/>
       </w:pPr>
       <w:r>
         <w:rPr>
           <w:b/>
           <w:bCs/>
         </w:rPr>
-        <w:t xml:space="preserve">Step 5. Launch</w:t>
-      </w:r>
-      <w:r>
-        <w:t xml:space="preserve"> with the invitation message in Section 6.</w:t>
+        <w:t xml:space="preserve">Fix wording before launch.</w:t>
+      </w:r>
+      <w:r>
+        <w:t xml:space="preserve"> Once responses arrive, changing an option breaks the match with the workbook, and the connector can no longer edit the survey.</w:t>
+      </w:r>
+    </w:p>
+    <w:p>
+      <w:pPr>
+        <w:spacing w:after="120" w:line="276"/>
+      </w:pPr>
+      <w:r>
+        <w:rPr>
+          <w:b/>
+          <w:bCs/>
+        </w:rPr>
+        <w:t xml:space="preserve">Pilot.</w:t>
+      </w:r>
+      <w:r>
+        <w:t xml:space="preserve"> Both of you click through the Preview, time it, and read each question aloud for anything confusing. If friends pilot it on the live link, delete their responses before analysis.</w:t>
+      </w:r>
+    </w:p>
+    <w:p>
+      <w:pPr>
+        <w:spacing w:after="120" w:line="276"/>
+      </w:pPr>
+      <w:r>
+        <w:rPr>
+          <w:b/>
+          <w:bCs/>
+        </w:rPr>
+        <w:t xml:space="preserve">Launch</w:t>
+      </w:r>
+      <w:r>
+        <w:t xml:space="preserve"> with the invitation message in Section 6, and do not edit questions after that.</w:t>
+      </w:r>
+    </w:p>
+    <w:p>
+      <w:pPr>
+        <w:pStyle w:val="Heading2"/>
+      </w:pPr>
+      <w:r>
+        <w:t xml:space="preserve">Google Forms backup</w:t>
+      </w:r>
+    </w:p>
+    <w:p>
+      <w:pPr>
+        <w:spacing w:after="120" w:line="276"/>
+      </w:pPr>
+      <w:r>
+        <w:t xml:space="preserve">To use Google Forms instead: script.google.com &gt; New project &gt; paste create_form.gs &gt; run createSurvey. Test the share link signed out in a private window, because a school account can restrict a form to the organisation. Full steps are in README.md in this folder.</w:t>
       </w:r>
     </w:p>
     <w:p>
@@ -4983,7 +5045,7 @@
                 <w:szCs w:val="19"/>
                 <w:shd w:fill="FFFF00" w:color="auto" w:val="clear"/>
               </w:rPr>
-              <w:t xml:space="preserve">[name]</w:t>
+              <w:t xml:space="preserve">[Adekunle or Alain]</w:t>
             </w:r>
           </w:p>
         </w:tc>
@@ -5141,7 +5203,7 @@
                 <w:szCs w:val="19"/>
                 <w:shd w:fill="FFFF00" w:color="auto" w:val="clear"/>
               </w:rPr>
-              <w:t xml:space="preserve">[name]</w:t>
+              <w:t xml:space="preserve">[Adekunle or Alain]</w:t>
             </w:r>
           </w:p>
         </w:tc>
@@ -5299,7 +5361,7 @@
                 <w:szCs w:val="19"/>
                 <w:shd w:fill="FFFF00" w:color="auto" w:val="clear"/>
               </w:rPr>
-              <w:t xml:space="preserve">[name]</w:t>
+              <w:t xml:space="preserve">[Adekunle or Alain]</w:t>
             </w:r>
           </w:p>
         </w:tc>
@@ -5457,7 +5519,7 @@
                 <w:szCs w:val="19"/>
                 <w:shd w:fill="FFFF00" w:color="auto" w:val="clear"/>
               </w:rPr>
-              <w:t xml:space="preserve">[name]</w:t>
+              <w:t xml:space="preserve">[Adekunle or Alain]</w:t>
             </w:r>
           </w:p>
         </w:tc>
@@ -6055,7 +6117,7 @@
                 <w:sz w:val="20"/>
                 <w:szCs w:val="20"/>
               </w:rPr>
-              <w:t xml:space="preserve">Hi! I'm doing a quick survey for my business analysis course at Fanshawe about how people use AI tools (like ChatGPT or Copilot) at work and in school. It takes about 4 minutes, it's completely anonymous, and you don't need to use AI to take part. Could you fill it in by </w:t>
+              <w:t xml:space="preserve">Hi! We're running a quick survey for our business analysis course at Fanshawe about how people use AI tools (like ChatGPT or Copilot) at work and in school. It takes about 4 minutes, it's completely anonymous, and you don't need to use AI to take part. Could you fill it in by </w:t>
             </w:r>
             <w:r>
               <w:rPr>
@@ -6070,27 +6132,19 @@
                 <w:sz w:val="20"/>
                 <w:szCs w:val="20"/>
               </w:rPr>
-              <w:t xml:space="preserve">? </w:t>
-            </w:r>
+              <w:t xml:space="preserve">? https://www.surveymonkey.com/r/PL9R5WL</w:t>
+            </w:r>
+          </w:p>
+          <w:p>
+            <w:pPr>
+              <w:spacing w:after="0"/>
+            </w:pPr>
             <w:r>
               <w:rPr>
                 <w:sz w:val="20"/>
                 <w:szCs w:val="20"/>
-                <w:shd w:fill="FFFF00" w:color="auto" w:val="clear"/>
-              </w:rPr>
-              <w:t xml:space="preserve">[survey link]</w:t>
-            </w:r>
-          </w:p>
-          <w:p>
-            <w:pPr>
-              <w:spacing w:after="0"/>
-            </w:pPr>
-            <w:r>
-              <w:rPr>
-                <w:sz w:val="20"/>
-                <w:szCs w:val="20"/>
-              </w:rPr>
-              <w:t xml:space="preserve">Thank you! And if you know someone 18+ who works or studies, please forward it on.</w:t>
+              </w:rPr>
+              <w:t xml:space="preserve">Thank you! And if you know someone 18+ who works or studies, please forward it on. Adekunle and Alain</w:t>
             </w:r>
           </w:p>
         </w:tc>
@@ -6191,7 +6245,7 @@
           <w:sz w:val="19"/>
           <w:szCs w:val="19"/>
         </w:rPr>
-        <w:t xml:space="preserve">Guide: the report must say who was responsible for what. For a team of 2 each person will hold more than one role. Edit to suit.</w:t>
+        <w:t xml:space="preserve">Guide: the report must say who was responsible for what. For a team of 2 each person holds more than one role. The split below is only a suggestion: swap it however you like, then record what actually happened in the report.</w:t>
       </w:r>
     </w:p>
     <w:tbl>
@@ -6407,9 +6461,8 @@
               <w:rPr>
                 <w:sz w:val="19"/>
                 <w:szCs w:val="19"/>
-                <w:shd w:fill="FFFF00" w:color="auto" w:val="clear"/>
-              </w:rPr>
-              <w:t xml:space="preserve">[name]</w:t>
+              </w:rPr>
+              <w:t xml:space="preserve">Adekunle (suggested)</w:t>
             </w:r>
           </w:p>
         </w:tc>
@@ -6474,7 +6527,7 @@
                 <w:sz w:val="19"/>
                 <w:szCs w:val="19"/>
               </w:rPr>
-              <w:t xml:space="preserve">Runs create_form.gs, tests and pilots the form, fixes wording</w:t>
+              <w:t xml:space="preserve">Runs create_form.gs in one Google account, tests and pilots the form, fixes wording, shares the response sheet</w:t>
             </w:r>
           </w:p>
         </w:tc>
@@ -6503,9 +6556,8 @@
               <w:rPr>
                 <w:sz w:val="19"/>
                 <w:szCs w:val="19"/>
-                <w:shd w:fill="FFFF00" w:color="auto" w:val="clear"/>
-              </w:rPr>
-              <w:t xml:space="preserve">[name]</w:t>
+              </w:rPr>
+              <w:t xml:space="preserve">Adekunle (suggested)</w:t>
             </w:r>
           </w:p>
         </w:tc>
@@ -6599,9 +6651,8 @@
               <w:rPr>
                 <w:sz w:val="19"/>
                 <w:szCs w:val="19"/>
-                <w:shd w:fill="FFFF00" w:color="auto" w:val="clear"/>
-              </w:rPr>
-              <w:t xml:space="preserve">[name]</w:t>
+              </w:rPr>
+              <w:t xml:space="preserve">Alain (suggested)</w:t>
             </w:r>
           </w:p>
         </w:tc>
@@ -6695,9 +6746,8 @@
               <w:rPr>
                 <w:sz w:val="19"/>
                 <w:szCs w:val="19"/>
-                <w:shd w:fill="FFFF00" w:color="auto" w:val="clear"/>
-              </w:rPr>
-              <w:t xml:space="preserve">[name]</w:t>
+              </w:rPr>
+              <w:t xml:space="preserve">Alain (suggested)</w:t>
             </w:r>
           </w:p>
         </w:tc>
@@ -6791,9 +6841,8 @@
               <w:rPr>
                 <w:sz w:val="19"/>
                 <w:szCs w:val="19"/>
-                <w:shd w:fill="FFFF00" w:color="auto" w:val="clear"/>
-              </w:rPr>
-              <w:t xml:space="preserve">[name]</w:t>
+              </w:rPr>
+              <w:t xml:space="preserve">Adekunle (suggested)</w:t>
             </w:r>
           </w:p>
         </w:tc>
@@ -6858,7 +6907,7 @@
                 <w:sz w:val="19"/>
                 <w:szCs w:val="19"/>
               </w:rPr>
-              <w:t xml:space="preserve">Agree the interpretation and conclusion; write the reflection together</w:t>
+              <w:t xml:space="preserve">Both invite people (different circles), agree the interpretation and conclusion, write the reflection together</w:t>
             </w:r>
           </w:p>
         </w:tc>
@@ -6888,7 +6937,7 @@
                 <w:sz w:val="19"/>
                 <w:szCs w:val="19"/>
               </w:rPr>
-              <w:t xml:space="preserve">Both</w:t>
+              <w:t xml:space="preserve">Adekunle and Alain</w:t>
             </w:r>
           </w:p>
         </w:tc>
@@ -6919,7 +6968,7 @@
         <w:t xml:space="preserve">☐  </w:t>
       </w:r>
       <w:r>
-        <w:t xml:space="preserve">Partner chosen and names recorded</w:t>
+        <w:t xml:space="preserve">Partner chosen (Adekunle Adeniji and Alain Rivera Sanchez) and roles confirmed</w:t>
       </w:r>
     </w:p>
     <w:p>
@@ -6943,7 +6992,7 @@
         <w:t xml:space="preserve">☐  </w:t>
       </w:r>
       <w:r>
-        <w:t xml:space="preserve">Form built, branching and Q10 limit tested</w:t>
+        <w:t xml:space="preserve">Survey previewed (Q4 to Q7 page marked skippable); SurveyMonkey plan checked for question and response limits</w:t>
       </w:r>
     </w:p>
     <w:p>
@@ -7031,7 +7080,7 @@
         <w:t xml:space="preserve">☐  </w:t>
       </w:r>
       <w:r>
-        <w:t xml:space="preserve">Pilot rows deleted; export pasted into the workbook at Responses!A1</w:t>
+        <w:t xml:space="preserve">Pilot responses deleted; export converted and loaded into the workbook's Responses sheet</w:t>
       </w:r>
     </w:p>
     <w:p>
@@ -7152,10 +7201,10 @@
           <w:b/>
           <w:bCs/>
         </w:rPr>
-        <w:t xml:space="preserve">Partner's name</w:t>
-      </w:r>
-      <w:r>
-        <w:t xml:space="preserve"> and the role split.</w:t>
+        <w:t xml:space="preserve">Role split.</w:t>
+      </w:r>
+      <w:r>
+        <w:t xml:space="preserve"> The suggested split in Section 7 is a starting point. Confirm who does what, and record what actually happened in the report.</w:t>
       </w:r>
     </w:p>
     <w:p>
@@ -7215,7 +7264,7 @@
         <w:t xml:space="preserve">Results link.</w:t>
       </w:r>
       <w:r>
-        <w:t xml:space="preserve"> The assignment sheet says 'Survey Monkey results'. That is leftover wording; use your Google Forms response sheet or a Forms summary link instead.</w:t>
+        <w:t xml:space="preserve"> The assignment asks for a link to your survey results. In SurveyMonkey use Analyze Results &gt; Share to get a shareable summary link, and test it signed out before you put it in the report.</w:t>
       </w:r>
     </w:p>
     <w:p>

</xml_diff>